<commit_message>
feat : version finale -30
</commit_message>
<xml_diff>
--- a/controle_codesign_FPGA_2025_2026.docx
+++ b/controle_codesign_FPGA_2025_2026.docx
@@ -1486,8 +1486,6 @@
             <w:r>
               <w:t xml:space="preserve"> (ce qui est la fréquence maximale acceptée par le composant)</w:t>
             </w:r>
-            <w:bookmarkStart w:id="0" w:name="_GoBack"/>
-            <w:bookmarkEnd w:id="0"/>
             <w:r>
               <w:t xml:space="preserve">, on a une période d’horloge de 25ns, donc chaque </w:t>
             </w:r>
@@ -3447,13 +3445,7 @@
           </w:tcPr>
           <w:p>
             <w:r>
-              <w:t xml:space="preserve">On crée notre projet pour une carte FPGA de la famille Cyclone IV, modèle : </w:t>
-            </w:r>
-            <w:r>
-              <w:t>EP4CE22F17C6</w:t>
-            </w:r>
-            <w:r>
-              <w:t xml:space="preserve">. </w:t>
+              <w:t xml:space="preserve">On crée notre projet pour une carte FPGA de la famille Cyclone IV, modèle : EP4CE22F17C6. </w:t>
             </w:r>
           </w:p>
           <w:p>
@@ -3720,13 +3712,74 @@
           <w:p>
             <w:pPr>
               <w:spacing w:after="120"/>
-            </w:pPr>
-            <w:r>
-              <w:rPr>
-                <w:b/>
+              <w:rPr>
+                <w:bCs/>
+              </w:rPr>
+            </w:pPr>
+            <w:r>
+              <w:rPr>
                 <w:bCs/>
               </w:rPr>
               <w:t>Réponse :</w:t>
+            </w:r>
+          </w:p>
+          <w:p>
+            <w:pPr>
+              <w:spacing w:after="120"/>
+            </w:pPr>
+            <w:r>
+              <w:rPr>
+                <w:bCs/>
+              </w:rPr>
+              <w:t xml:space="preserve">On va choisir de générer une PLL qui prend en entrée la </w:t>
+            </w:r>
+            <w:proofErr w:type="spellStart"/>
+            <w:r>
+              <w:rPr>
+                <w:bCs/>
+              </w:rPr>
+              <w:t>clock</w:t>
+            </w:r>
+            <w:proofErr w:type="spellEnd"/>
+            <w:r>
+              <w:rPr>
+                <w:bCs/>
+              </w:rPr>
+              <w:t xml:space="preserve"> de 50 MHz</w:t>
+            </w:r>
+            <w:r>
+              <w:rPr>
+                <w:bCs/>
+              </w:rPr>
+              <w:t xml:space="preserve"> et qui va en sortie amenée une </w:t>
+            </w:r>
+            <w:proofErr w:type="spellStart"/>
+            <w:r>
+              <w:rPr>
+                <w:bCs/>
+              </w:rPr>
+              <w:t>clock</w:t>
+            </w:r>
+            <w:proofErr w:type="spellEnd"/>
+            <w:r>
+              <w:rPr>
+                <w:bCs/>
+              </w:rPr>
+              <w:t xml:space="preserve"> de 40 MHz. Vu que nos calculs précédents ont tous été faits en prenant en compte le fait qu’on a une </w:t>
+            </w:r>
+            <w:proofErr w:type="spellStart"/>
+            <w:r>
+              <w:rPr>
+                <w:bCs/>
+              </w:rPr>
+              <w:t>clock</w:t>
+            </w:r>
+            <w:proofErr w:type="spellEnd"/>
+            <w:r>
+              <w:rPr>
+                <w:bCs/>
+              </w:rPr>
+              <w:t xml:space="preserve"> de 40MHz, cela ne change rien pour le reste de l’architecture, à part la création d’un nouveau composant.</w:t>
             </w:r>
           </w:p>
         </w:tc>
@@ -3746,31 +3799,8 @@
             </w:tcMar>
           </w:tcPr>
           <w:p>
-            <w:r>
-              <w:t xml:space="preserve"> </w:t>
-            </w:r>
-          </w:p>
-          <w:p>
-            <w:r>
-              <w:t xml:space="preserve"> </w:t>
-            </w:r>
-          </w:p>
-          <w:p>
-            <w:r>
-              <w:t xml:space="preserve"> </w:t>
-            </w:r>
-          </w:p>
-          <w:p>
-            <w:r>
-              <w:t xml:space="preserve"> </w:t>
-            </w:r>
-          </w:p>
-          <w:p>
-            <w:r>
-              <w:t xml:space="preserve"> </w:t>
-            </w:r>
-          </w:p>
-          <w:p>
+            <w:bookmarkStart w:id="0" w:name="_GoBack"/>
+            <w:bookmarkEnd w:id="0"/>
             <w:r>
               <w:t xml:space="preserve"> </w:t>
             </w:r>

</xml_diff>